<commit_message>
Add GVK verification framework and regression tests
- merge_gvk.py: UTF-16 TXT support, TOC entry detection, per-file gap
  checks in verify(), verify_output() after merge, write_verify_report()
  for --verify-report flag, _is_latha_para() helper
- test_gvk.py: 11 formatting regression tests on trialphase1and2 baseline
  (structure, prefixes, font/size, spacing, blanks, file2 num strip, headers)
- REQUIREMENTS.md: updated with verification spec, test runner, new flags

Co-Authored-By: Claude Sonnet 4.6 (1M context) <noreply@anthropic.com>
</commit_message>
<xml_diff>
--- a/gvk/trialphase1and2/1-11 gvk merged.docx
+++ b/gvk/trialphase1and2/1-11 gvk merged.docx
@@ -47,62 +47,56 @@
         <w:tab/>
         <w:t>அருளவா வான்மே லலந்துபடா துள்ளந்</w:t>
       </w:r>
-      <w:r>
-        <w:rPr>
-          <w:rFonts w:ascii="Latha" w:cs="Latha" w:eastAsia="Latha" w:hAnsi="Latha"/>
-          <w:sz w:val="20"/>
-          <w:szCs w:val="20"/>
-          <w:rtl w:val="0"/>
-        </w:rPr>
-        <w:br/>
-      </w:r>
-      <w:r>
-        <w:rPr>
-          <w:rFonts w:ascii="Latha" w:cs="Latha" w:eastAsia="Latha" w:hAnsi="Latha"/>
-          <w:sz w:val="20"/>
-          <w:szCs w:val="20"/>
-          <w:rtl w:val="0"/>
-        </w:rPr>
+    </w:p>
+    <w:p>
+      <w:pPr>
+        <w:spacing w:line="360" w:lineRule="auto"/>
+      </w:pPr>
+      <w:r>
+        <w:rPr>
+          <w:rFonts w:ascii="Latha" w:cs="Latha" w:eastAsia="Latha" w:hAnsi="Latha"/>
+          <w:sz w:val="20"/>
+          <w:szCs w:val="20"/>
+          <w:rtl w:val="0"/>
+        </w:rPr>
+        <w:tab/>
         <w:t>தெருளவான் மாவாத் திகழும் - மருளவாய்</w:t>
       </w:r>
-      <w:r>
-        <w:rPr>
-          <w:rFonts w:ascii="Latha" w:cs="Latha" w:eastAsia="Latha" w:hAnsi="Latha"/>
-          <w:sz w:val="20"/>
-          <w:szCs w:val="20"/>
-          <w:rtl w:val="0"/>
-        </w:rPr>
-        <w:br/>
-      </w:r>
-      <w:r>
-        <w:rPr>
-          <w:rFonts w:ascii="Latha" w:cs="Latha" w:eastAsia="Latha" w:hAnsi="Latha"/>
-          <w:sz w:val="20"/>
-          <w:szCs w:val="20"/>
-          <w:rtl w:val="0"/>
-        </w:rPr>
+    </w:p>
+    <w:p>
+      <w:pPr>
+        <w:spacing w:line="360" w:lineRule="auto"/>
+      </w:pPr>
+      <w:r>
+        <w:rPr>
+          <w:rFonts w:ascii="Latha" w:cs="Latha" w:eastAsia="Latha" w:hAnsi="Latha"/>
+          <w:sz w:val="20"/>
+          <w:szCs w:val="20"/>
+          <w:rtl w:val="0"/>
+        </w:rPr>
+        <w:tab/>
         <w:t>நின்றயா னென்னதெனு நீசமனப் பான்மையறத்</w:t>
       </w:r>
-      <w:r>
-        <w:rPr>
-          <w:rFonts w:ascii="Latha" w:cs="Latha" w:eastAsia="Latha" w:hAnsi="Latha"/>
-          <w:sz w:val="20"/>
-          <w:szCs w:val="20"/>
-          <w:rtl w:val="0"/>
-        </w:rPr>
-        <w:br/>
-      </w:r>
-      <w:r>
-        <w:rPr>
-          <w:rFonts w:ascii="Latha" w:cs="Latha" w:eastAsia="Latha" w:hAnsi="Latha"/>
-          <w:sz w:val="20"/>
-          <w:szCs w:val="20"/>
-          <w:rtl w:val="0"/>
-        </w:rPr>
+    </w:p>
+    <w:p>
+      <w:pPr>
+        <w:spacing w:line="360" w:lineRule="auto"/>
+      </w:pPr>
+      <w:r>
+        <w:rPr>
+          <w:rFonts w:ascii="Latha" w:cs="Latha" w:eastAsia="Latha" w:hAnsi="Latha"/>
+          <w:sz w:val="20"/>
+          <w:szCs w:val="20"/>
+          <w:rtl w:val="0"/>
+        </w:rPr>
+        <w:tab/>
         <w:t>துன்றுகுரு போதச் சுடர்.</w:t>
       </w:r>
     </w:p>
     <w:p>
+      <w:pPr/>
+    </w:p>
+    <w:p>
       <w:pPr>
         <w:spacing w:line="360" w:lineRule="auto"/>
       </w:pPr>
@@ -117,6 +111,9 @@
       </w:r>
     </w:p>
     <w:p>
+      <w:pPr/>
+    </w:p>
+    <w:p>
       <w:pPr>
         <w:spacing w:line="360" w:lineRule="auto"/>
       </w:pPr>
@@ -131,6 +128,9 @@
       </w:r>
     </w:p>
     <w:p>
+      <w:pPr/>
+    </w:p>
+    <w:p>
       <w:pPr>
         <w:spacing w:line="360" w:lineRule="auto"/>
       </w:pPr>
@@ -145,6 +145,9 @@
       </w:r>
     </w:p>
     <w:p>
+      <w:pPr/>
+    </w:p>
+    <w:p>
       <w:pPr>
         <w:spacing w:line="360" w:lineRule="auto"/>
       </w:pPr>
@@ -253,62 +256,56 @@
         <w:tab/>
         <w:t>உடலுருவாப் பேதுற் றுஒன்றேனை யூத்தைச்</w:t>
       </w:r>
-      <w:r>
-        <w:rPr>
-          <w:rFonts w:ascii="Latha" w:cs="Latha" w:eastAsia="Latha" w:hAnsi="Latha"/>
-          <w:sz w:val="20"/>
-          <w:szCs w:val="20"/>
-          <w:rtl w:val="0"/>
-        </w:rPr>
-        <w:br/>
-      </w:r>
-      <w:r>
-        <w:rPr>
-          <w:rFonts w:ascii="Latha" w:cs="Latha" w:eastAsia="Latha" w:hAnsi="Latha"/>
-          <w:sz w:val="20"/>
-          <w:szCs w:val="20"/>
-          <w:rtl w:val="0"/>
-        </w:rPr>
+    </w:p>
+    <w:p>
+      <w:pPr>
+        <w:spacing w:line="360" w:lineRule="auto"/>
+      </w:pPr>
+      <w:r>
+        <w:rPr>
+          <w:rFonts w:ascii="Latha" w:cs="Latha" w:eastAsia="Latha" w:hAnsi="Latha"/>
+          <w:sz w:val="20"/>
+          <w:szCs w:val="20"/>
+          <w:rtl w:val="0"/>
+        </w:rPr>
+        <w:tab/>
         <w:t>சடவுருநா னன்றாகத் தள்ளிக் - கெடலருமெய்ஞ்</w:t>
       </w:r>
-      <w:r>
-        <w:rPr>
-          <w:rFonts w:ascii="Latha" w:cs="Latha" w:eastAsia="Latha" w:hAnsi="Latha"/>
-          <w:sz w:val="20"/>
-          <w:szCs w:val="20"/>
-          <w:rtl w:val="0"/>
-        </w:rPr>
-        <w:br/>
-      </w:r>
-      <w:r>
-        <w:rPr>
-          <w:rFonts w:ascii="Latha" w:cs="Latha" w:eastAsia="Latha" w:hAnsi="Latha"/>
-          <w:sz w:val="20"/>
-          <w:szCs w:val="20"/>
-          <w:rtl w:val="0"/>
-        </w:rPr>
+    </w:p>
+    <w:p>
+      <w:pPr>
+        <w:spacing w:line="360" w:lineRule="auto"/>
+      </w:pPr>
+      <w:r>
+        <w:rPr>
+          <w:rFonts w:ascii="Latha" w:cs="Latha" w:eastAsia="Latha" w:hAnsi="Latha"/>
+          <w:sz w:val="20"/>
+          <w:szCs w:val="20"/>
+          <w:rtl w:val="0"/>
+        </w:rPr>
+        <w:tab/>
         <w:t>ஞானகுரு வாக நயந்தாண்ட நல்லவருண்</w:t>
       </w:r>
-      <w:r>
-        <w:rPr>
-          <w:rFonts w:ascii="Latha" w:cs="Latha" w:eastAsia="Latha" w:hAnsi="Latha"/>
-          <w:sz w:val="20"/>
-          <w:szCs w:val="20"/>
-          <w:rtl w:val="0"/>
-        </w:rPr>
-        <w:br/>
-      </w:r>
-      <w:r>
-        <w:rPr>
-          <w:rFonts w:ascii="Latha" w:cs="Latha" w:eastAsia="Latha" w:hAnsi="Latha"/>
-          <w:sz w:val="20"/>
-          <w:szCs w:val="20"/>
-          <w:rtl w:val="0"/>
-        </w:rPr>
+    </w:p>
+    <w:p>
+      <w:pPr>
+        <w:spacing w:line="360" w:lineRule="auto"/>
+      </w:pPr>
+      <w:r>
+        <w:rPr>
+          <w:rFonts w:ascii="Latha" w:cs="Latha" w:eastAsia="Latha" w:hAnsi="Latha"/>
+          <w:sz w:val="20"/>
+          <w:szCs w:val="20"/>
+          <w:rtl w:val="0"/>
+        </w:rPr>
+        <w:tab/>
         <w:t>மோனகுரு பாதம் முடி.</w:t>
       </w:r>
     </w:p>
     <w:p>
+      <w:pPr/>
+    </w:p>
+    <w:p>
       <w:pPr>
         <w:spacing w:line="360" w:lineRule="auto"/>
       </w:pPr>
@@ -323,6 +320,9 @@
       </w:r>
     </w:p>
     <w:p>
+      <w:pPr/>
+    </w:p>
+    <w:p>
       <w:pPr>
         <w:spacing w:line="360" w:lineRule="auto"/>
       </w:pPr>
@@ -414,62 +414,56 @@
         <w:tab/>
         <w:t>மிகவேறு பட்ட விவாதங்கட் கெல்லாந்</w:t>
       </w:r>
-      <w:r>
-        <w:rPr>
-          <w:rFonts w:ascii="Latha" w:cs="Latha" w:eastAsia="Latha" w:hAnsi="Latha"/>
-          <w:sz w:val="20"/>
-          <w:szCs w:val="20"/>
-          <w:rtl w:val="0"/>
-        </w:rPr>
-        <w:br/>
-      </w:r>
-      <w:r>
-        <w:rPr>
-          <w:rFonts w:ascii="Latha" w:cs="Latha" w:eastAsia="Latha" w:hAnsi="Latha"/>
-          <w:sz w:val="20"/>
-          <w:szCs w:val="20"/>
-          <w:rtl w:val="0"/>
-        </w:rPr>
+    </w:p>
+    <w:p>
+      <w:pPr>
+        <w:spacing w:line="360" w:lineRule="auto"/>
+      </w:pPr>
+      <w:r>
+        <w:rPr>
+          <w:rFonts w:ascii="Latha" w:cs="Latha" w:eastAsia="Latha" w:hAnsi="Latha"/>
+          <w:sz w:val="20"/>
+          <w:szCs w:val="20"/>
+          <w:rtl w:val="0"/>
+        </w:rPr>
+        <w:tab/>
         <w:t>தொகவே சமரசமாத் தோன்றத் - தகவே</w:t>
       </w:r>
-      <w:r>
-        <w:rPr>
-          <w:rFonts w:ascii="Latha" w:cs="Latha" w:eastAsia="Latha" w:hAnsi="Latha"/>
-          <w:sz w:val="20"/>
-          <w:szCs w:val="20"/>
-          <w:rtl w:val="0"/>
-        </w:rPr>
-        <w:br/>
-      </w:r>
-      <w:r>
-        <w:rPr>
-          <w:rFonts w:ascii="Latha" w:cs="Latha" w:eastAsia="Latha" w:hAnsi="Latha"/>
-          <w:sz w:val="20"/>
-          <w:szCs w:val="20"/>
-          <w:rtl w:val="0"/>
-        </w:rPr>
+    </w:p>
+    <w:p>
+      <w:pPr>
+        <w:spacing w:line="360" w:lineRule="auto"/>
+      </w:pPr>
+      <w:r>
+        <w:rPr>
+          <w:rFonts w:ascii="Latha" w:cs="Latha" w:eastAsia="Latha" w:hAnsi="Latha"/>
+          <w:sz w:val="20"/>
+          <w:szCs w:val="20"/>
+          <w:rtl w:val="0"/>
+        </w:rPr>
+        <w:tab/>
         <w:t>சமர்த்தித்து மெய்ப்பொருளைத் தந்துரைக்கும் போத</w:t>
       </w:r>
-      <w:r>
-        <w:rPr>
-          <w:rFonts w:ascii="Latha" w:cs="Latha" w:eastAsia="Latha" w:hAnsi="Latha"/>
-          <w:sz w:val="20"/>
-          <w:szCs w:val="20"/>
-          <w:rtl w:val="0"/>
-        </w:rPr>
-        <w:br/>
-      </w:r>
-      <w:r>
-        <w:rPr>
-          <w:rFonts w:ascii="Latha" w:cs="Latha" w:eastAsia="Latha" w:hAnsi="Latha"/>
-          <w:sz w:val="20"/>
-          <w:szCs w:val="20"/>
-          <w:rtl w:val="0"/>
-        </w:rPr>
+    </w:p>
+    <w:p>
+      <w:pPr>
+        <w:spacing w:line="360" w:lineRule="auto"/>
+      </w:pPr>
+      <w:r>
+        <w:rPr>
+          <w:rFonts w:ascii="Latha" w:cs="Latha" w:eastAsia="Latha" w:hAnsi="Latha"/>
+          <w:sz w:val="20"/>
+          <w:szCs w:val="20"/>
+          <w:rtl w:val="0"/>
+        </w:rPr>
+        <w:tab/>
         <w:t>சமர்த்தகுரு பாதந் தலை.</w:t>
       </w:r>
     </w:p>
     <w:p>
+      <w:pPr/>
+    </w:p>
+    <w:p>
       <w:pPr>
         <w:spacing w:line="360" w:lineRule="auto"/>
       </w:pPr>
@@ -484,6 +478,9 @@
       </w:r>
     </w:p>
     <w:p>
+      <w:pPr/>
+    </w:p>
+    <w:p>
       <w:pPr>
         <w:spacing w:line="360" w:lineRule="auto"/>
       </w:pPr>
@@ -496,6 +493,9 @@
         </w:rPr>
         <w:t>தகவே-தக்கவாறு.</w:t>
       </w:r>
+    </w:p>
+    <w:p>
+      <w:pPr/>
     </w:p>
     <w:p>
       <w:pPr>
@@ -587,62 +587,56 @@
         <w:tab/>
         <w:t>தெளிந்த பரமார்த்த தீபமீ துண்மை</w:t>
       </w:r>
-      <w:r>
-        <w:rPr>
-          <w:rFonts w:ascii="Latha" w:cs="Latha" w:eastAsia="Latha" w:hAnsi="Latha"/>
-          <w:sz w:val="20"/>
-          <w:szCs w:val="20"/>
-          <w:rtl w:val="0"/>
-        </w:rPr>
-        <w:br/>
-      </w:r>
-      <w:r>
-        <w:rPr>
-          <w:rFonts w:ascii="Latha" w:cs="Latha" w:eastAsia="Latha" w:hAnsi="Latha"/>
-          <w:sz w:val="20"/>
-          <w:szCs w:val="20"/>
-          <w:rtl w:val="0"/>
-        </w:rPr>
+    </w:p>
+    <w:p>
+      <w:pPr>
+        <w:spacing w:line="360" w:lineRule="auto"/>
+      </w:pPr>
+      <w:r>
+        <w:rPr>
+          <w:rFonts w:ascii="Latha" w:cs="Latha" w:eastAsia="Latha" w:hAnsi="Latha"/>
+          <w:sz w:val="20"/>
+          <w:szCs w:val="20"/>
+          <w:rtl w:val="0"/>
+        </w:rPr>
+        <w:tab/>
         <w:t>ஒளிர்ந்திடக்கா ணாத வுளத்தேன் - இளந்தை</w:t>
       </w:r>
-      <w:r>
-        <w:rPr>
-          <w:rFonts w:ascii="Latha" w:cs="Latha" w:eastAsia="Latha" w:hAnsi="Latha"/>
-          <w:sz w:val="20"/>
-          <w:szCs w:val="20"/>
-          <w:rtl w:val="0"/>
-        </w:rPr>
-        <w:br/>
-      </w:r>
-      <w:r>
-        <w:rPr>
-          <w:rFonts w:ascii="Latha" w:cs="Latha" w:eastAsia="Latha" w:hAnsi="Latha"/>
-          <w:sz w:val="20"/>
-          <w:szCs w:val="20"/>
-          <w:rtl w:val="0"/>
-        </w:rPr>
+    </w:p>
+    <w:p>
+      <w:pPr>
+        <w:spacing w:line="360" w:lineRule="auto"/>
+      </w:pPr>
+      <w:r>
+        <w:rPr>
+          <w:rFonts w:ascii="Latha" w:cs="Latha" w:eastAsia="Latha" w:hAnsi="Latha"/>
+          <w:sz w:val="20"/>
+          <w:szCs w:val="20"/>
+          <w:rtl w:val="0"/>
+        </w:rPr>
+        <w:tab/>
         <w:t>அறிவாற் கொளுத்தியதன் றாண்டரம ணன்மூ</w:t>
       </w:r>
-      <w:r>
-        <w:rPr>
-          <w:rFonts w:ascii="Latha" w:cs="Latha" w:eastAsia="Latha" w:hAnsi="Latha"/>
-          <w:sz w:val="20"/>
-          <w:szCs w:val="20"/>
-          <w:rtl w:val="0"/>
-        </w:rPr>
-        <w:br/>
-      </w:r>
-      <w:r>
-        <w:rPr>
-          <w:rFonts w:ascii="Latha" w:cs="Latha" w:eastAsia="Latha" w:hAnsi="Latha"/>
-          <w:sz w:val="20"/>
-          <w:szCs w:val="20"/>
-          <w:rtl w:val="0"/>
-        </w:rPr>
+    </w:p>
+    <w:p>
+      <w:pPr>
+        <w:spacing w:line="360" w:lineRule="auto"/>
+      </w:pPr>
+      <w:r>
+        <w:rPr>
+          <w:rFonts w:ascii="Latha" w:cs="Latha" w:eastAsia="Latha" w:hAnsi="Latha"/>
+          <w:sz w:val="20"/>
+          <w:szCs w:val="20"/>
+          <w:rtl w:val="0"/>
+        </w:rPr>
+        <w:tab/>
         <w:t>தறிவாற் கொளுத்திய தாம்.</w:t>
       </w:r>
     </w:p>
     <w:p>
+      <w:pPr/>
+    </w:p>
+    <w:p>
       <w:pPr>
         <w:spacing w:line="360" w:lineRule="auto"/>
       </w:pPr>
@@ -657,6 +651,9 @@
       </w:r>
     </w:p>
     <w:p>
+      <w:pPr/>
+    </w:p>
+    <w:p>
       <w:pPr>
         <w:spacing w:line="360" w:lineRule="auto"/>
       </w:pPr>
@@ -731,62 +728,56 @@
         <w:tab/>
         <w:t>ஒளிர்மெய் யுணர்வாக வுள்ளதே தானாக்</w:t>
       </w:r>
-      <w:r>
-        <w:rPr>
-          <w:rFonts w:ascii="Latha" w:cs="Latha" w:eastAsia="Latha" w:hAnsi="Latha"/>
-          <w:sz w:val="20"/>
-          <w:szCs w:val="20"/>
-          <w:rtl w:val="0"/>
-        </w:rPr>
-        <w:br/>
-      </w:r>
-      <w:r>
-        <w:rPr>
-          <w:rFonts w:ascii="Latha" w:cs="Latha" w:eastAsia="Latha" w:hAnsi="Latha"/>
-          <w:sz w:val="20"/>
-          <w:szCs w:val="20"/>
-          <w:rtl w:val="0"/>
-        </w:rPr>
+    </w:p>
+    <w:p>
+      <w:pPr>
+        <w:spacing w:line="360" w:lineRule="auto"/>
+      </w:pPr>
+      <w:r>
+        <w:rPr>
+          <w:rFonts w:ascii="Latha" w:cs="Latha" w:eastAsia="Latha" w:hAnsi="Latha"/>
+          <w:sz w:val="20"/>
+          <w:szCs w:val="20"/>
+          <w:rtl w:val="0"/>
+        </w:rPr>
+        <w:tab/>
         <w:t>கிளர்சொருப மானவருட் கேள்வன் - தளர்வறவே</w:t>
       </w:r>
-      <w:r>
-        <w:rPr>
-          <w:rFonts w:ascii="Latha" w:cs="Latha" w:eastAsia="Latha" w:hAnsi="Latha"/>
-          <w:sz w:val="20"/>
-          <w:szCs w:val="20"/>
-          <w:rtl w:val="0"/>
-        </w:rPr>
-        <w:br/>
-      </w:r>
-      <w:r>
-        <w:rPr>
-          <w:rFonts w:ascii="Latha" w:cs="Latha" w:eastAsia="Latha" w:hAnsi="Latha"/>
-          <w:sz w:val="20"/>
-          <w:szCs w:val="20"/>
-          <w:rtl w:val="0"/>
-        </w:rPr>
+    </w:p>
+    <w:p>
+      <w:pPr>
+        <w:spacing w:line="360" w:lineRule="auto"/>
+      </w:pPr>
+      <w:r>
+        <w:rPr>
+          <w:rFonts w:ascii="Latha" w:cs="Latha" w:eastAsia="Latha" w:hAnsi="Latha"/>
+          <w:sz w:val="20"/>
+          <w:szCs w:val="20"/>
+          <w:rtl w:val="0"/>
+        </w:rPr>
+        <w:tab/>
         <w:t>சாற்றியபல் போதனையுட் சார்ந்தசில ஞாபகத்திற்</w:t>
       </w:r>
-      <w:r>
-        <w:rPr>
-          <w:rFonts w:ascii="Latha" w:cs="Latha" w:eastAsia="Latha" w:hAnsi="Latha"/>
-          <w:sz w:val="20"/>
-          <w:szCs w:val="20"/>
-          <w:rtl w:val="0"/>
-        </w:rPr>
-        <w:br/>
-      </w:r>
-      <w:r>
-        <w:rPr>
-          <w:rFonts w:ascii="Latha" w:cs="Latha" w:eastAsia="Latha" w:hAnsi="Latha"/>
-          <w:sz w:val="20"/>
-          <w:szCs w:val="20"/>
-          <w:rtl w:val="0"/>
-        </w:rPr>
+    </w:p>
+    <w:p>
+      <w:pPr>
+        <w:spacing w:line="360" w:lineRule="auto"/>
+      </w:pPr>
+      <w:r>
+        <w:rPr>
+          <w:rFonts w:ascii="Latha" w:cs="Latha" w:eastAsia="Latha" w:hAnsi="Latha"/>
+          <w:sz w:val="20"/>
+          <w:szCs w:val="20"/>
+          <w:rtl w:val="0"/>
+        </w:rPr>
+        <w:tab/>
         <w:t>போற்றியுரைக் கின்றேன் புலத்து.</w:t>
       </w:r>
     </w:p>
     <w:p>
+      <w:pPr/>
+    </w:p>
+    <w:p>
       <w:pPr>
         <w:spacing w:line="360" w:lineRule="auto"/>
       </w:pPr>
@@ -874,62 +865,56 @@
         <w:tab/>
         <w:t>எங்கிருந் தேரமண னென்னை யணைந்தானோ</w:t>
       </w:r>
-      <w:r>
-        <w:rPr>
-          <w:rFonts w:ascii="Latha" w:cs="Latha" w:eastAsia="Latha" w:hAnsi="Latha"/>
-          <w:sz w:val="20"/>
-          <w:szCs w:val="20"/>
-          <w:rtl w:val="0"/>
-        </w:rPr>
-        <w:br/>
-      </w:r>
-      <w:r>
-        <w:rPr>
-          <w:rFonts w:ascii="Latha" w:cs="Latha" w:eastAsia="Latha" w:hAnsi="Latha"/>
-          <w:sz w:val="20"/>
-          <w:szCs w:val="20"/>
-          <w:rtl w:val="0"/>
-        </w:rPr>
+    </w:p>
+    <w:p>
+      <w:pPr>
+        <w:spacing w:line="360" w:lineRule="auto"/>
+      </w:pPr>
+      <w:r>
+        <w:rPr>
+          <w:rFonts w:ascii="Latha" w:cs="Latha" w:eastAsia="Latha" w:hAnsi="Latha"/>
+          <w:sz w:val="20"/>
+          <w:szCs w:val="20"/>
+          <w:rtl w:val="0"/>
+        </w:rPr>
+        <w:tab/>
         <w:t>வங்கிருந்தே நானுமவ் வாண்டானோ - டெங்க</w:t>
       </w:r>
-      <w:r>
-        <w:rPr>
-          <w:rFonts w:ascii="Latha" w:cs="Latha" w:eastAsia="Latha" w:hAnsi="Latha"/>
-          <w:sz w:val="20"/>
-          <w:szCs w:val="20"/>
-          <w:rtl w:val="0"/>
-        </w:rPr>
-        <w:br/>
-      </w:r>
-      <w:r>
-        <w:rPr>
-          <w:rFonts w:ascii="Latha" w:cs="Latha" w:eastAsia="Latha" w:hAnsi="Latha"/>
-          <w:sz w:val="20"/>
-          <w:szCs w:val="20"/>
-          <w:rtl w:val="0"/>
-        </w:rPr>
+    </w:p>
+    <w:p>
+      <w:pPr>
+        <w:spacing w:line="360" w:lineRule="auto"/>
+      </w:pPr>
+      <w:r>
+        <w:rPr>
+          <w:rFonts w:ascii="Latha" w:cs="Latha" w:eastAsia="Latha" w:hAnsi="Latha"/>
+          <w:sz w:val="20"/>
+          <w:szCs w:val="20"/>
+          <w:rtl w:val="0"/>
+        </w:rPr>
+        <w:tab/>
         <w:t>ளொருமித்த வாழ்வி லுணர்ந்தபர மார்த்த</w:t>
       </w:r>
-      <w:r>
-        <w:rPr>
-          <w:rFonts w:ascii="Latha" w:cs="Latha" w:eastAsia="Latha" w:hAnsi="Latha"/>
-          <w:sz w:val="20"/>
-          <w:szCs w:val="20"/>
-          <w:rtl w:val="0"/>
-        </w:rPr>
-        <w:br/>
-      </w:r>
-      <w:r>
-        <w:rPr>
-          <w:rFonts w:ascii="Latha" w:cs="Latha" w:eastAsia="Latha" w:hAnsi="Latha"/>
-          <w:sz w:val="20"/>
-          <w:szCs w:val="20"/>
-          <w:rtl w:val="0"/>
-        </w:rPr>
+    </w:p>
+    <w:p>
+      <w:pPr>
+        <w:spacing w:line="360" w:lineRule="auto"/>
+      </w:pPr>
+      <w:r>
+        <w:rPr>
+          <w:rFonts w:ascii="Latha" w:cs="Latha" w:eastAsia="Latha" w:hAnsi="Latha"/>
+          <w:sz w:val="20"/>
+          <w:szCs w:val="20"/>
+          <w:rtl w:val="0"/>
+        </w:rPr>
+        <w:tab/>
         <w:t>தருமத்தை யோதுவேன் சற்று.</w:t>
       </w:r>
     </w:p>
     <w:p>
+      <w:pPr/>
+    </w:p>
+    <w:p>
       <w:pPr>
         <w:spacing w:line="360" w:lineRule="auto"/>
       </w:pPr>
@@ -944,6 +929,9 @@
       </w:r>
     </w:p>
     <w:p>
+      <w:pPr/>
+    </w:p>
+    <w:p>
       <w:pPr>
         <w:spacing w:line="360" w:lineRule="auto"/>
       </w:pPr>
@@ -1017,62 +1005,56 @@
         <w:tab/>
         <w:t>முளைத்த வகந்தைமதி மோகமற வென்னைத்</w:t>
       </w:r>
-      <w:r>
-        <w:rPr>
-          <w:rFonts w:ascii="Latha" w:cs="Latha" w:eastAsia="Latha" w:hAnsi="Latha"/>
-          <w:sz w:val="20"/>
-          <w:szCs w:val="20"/>
-          <w:rtl w:val="0"/>
-        </w:rPr>
-        <w:br/>
-      </w:r>
-      <w:r>
-        <w:rPr>
-          <w:rFonts w:ascii="Latha" w:cs="Latha" w:eastAsia="Latha" w:hAnsi="Latha"/>
-          <w:sz w:val="20"/>
-          <w:szCs w:val="20"/>
-          <w:rtl w:val="0"/>
-        </w:rPr>
+    </w:p>
+    <w:p>
+      <w:pPr>
+        <w:spacing w:line="360" w:lineRule="auto"/>
+      </w:pPr>
+      <w:r>
+        <w:rPr>
+          <w:rFonts w:ascii="Latha" w:cs="Latha" w:eastAsia="Latha" w:hAnsi="Latha"/>
+          <w:sz w:val="20"/>
+          <w:szCs w:val="20"/>
+          <w:rtl w:val="0"/>
+        </w:rPr>
+        <w:tab/>
         <w:t>தெளித்த ரமணகுரு தேவன் - அளித்தவருட்</w:t>
       </w:r>
-      <w:r>
-        <w:rPr>
-          <w:rFonts w:ascii="Latha" w:cs="Latha" w:eastAsia="Latha" w:hAnsi="Latha"/>
-          <w:sz w:val="20"/>
-          <w:szCs w:val="20"/>
-          <w:rtl w:val="0"/>
-        </w:rPr>
-        <w:br/>
-      </w:r>
-      <w:r>
-        <w:rPr>
-          <w:rFonts w:ascii="Latha" w:cs="Latha" w:eastAsia="Latha" w:hAnsi="Latha"/>
-          <w:sz w:val="20"/>
-          <w:szCs w:val="20"/>
-          <w:rtl w:val="0"/>
-        </w:rPr>
+    </w:p>
+    <w:p>
+      <w:pPr>
+        <w:spacing w:line="360" w:lineRule="auto"/>
+      </w:pPr>
+      <w:r>
+        <w:rPr>
+          <w:rFonts w:ascii="Latha" w:cs="Latha" w:eastAsia="Latha" w:hAnsi="Latha"/>
+          <w:sz w:val="20"/>
+          <w:szCs w:val="20"/>
+          <w:rtl w:val="0"/>
+        </w:rPr>
+        <w:tab/>
         <w:t>பார்வையாற் கண்ட பரமார்த்த பாவமொரு</w:t>
       </w:r>
-      <w:r>
-        <w:rPr>
-          <w:rFonts w:ascii="Latha" w:cs="Latha" w:eastAsia="Latha" w:hAnsi="Latha"/>
-          <w:sz w:val="20"/>
-          <w:szCs w:val="20"/>
-          <w:rtl w:val="0"/>
-        </w:rPr>
-        <w:br/>
-      </w:r>
-      <w:r>
-        <w:rPr>
-          <w:rFonts w:ascii="Latha" w:cs="Latha" w:eastAsia="Latha" w:hAnsi="Latha"/>
-          <w:sz w:val="20"/>
-          <w:szCs w:val="20"/>
-          <w:rtl w:val="0"/>
-        </w:rPr>
+    </w:p>
+    <w:p>
+      <w:pPr>
+        <w:spacing w:line="360" w:lineRule="auto"/>
+      </w:pPr>
+      <w:r>
+        <w:rPr>
+          <w:rFonts w:ascii="Latha" w:cs="Latha" w:eastAsia="Latha" w:hAnsi="Latha"/>
+          <w:sz w:val="20"/>
+          <w:szCs w:val="20"/>
+          <w:rtl w:val="0"/>
+        </w:rPr>
+        <w:tab/>
         <w:t>கோவையாக் கோப்பேன் குறித்து.</w:t>
       </w:r>
     </w:p>
     <w:p>
+      <w:pPr/>
+    </w:p>
+    <w:p>
       <w:pPr>
         <w:spacing w:line="360" w:lineRule="auto"/>
       </w:pPr>
@@ -1087,6 +1069,9 @@
       </w:r>
     </w:p>
     <w:p>
+      <w:pPr/>
+    </w:p>
+    <w:p>
       <w:pPr>
         <w:spacing w:line="360" w:lineRule="auto"/>
       </w:pPr>
@@ -1099,6 +1084,9 @@
         </w:rPr>
         <w:t>தெளிந்த-தெளிவித்த.</w:t>
       </w:r>
+    </w:p>
+    <w:p>
+      <w:pPr/>
     </w:p>
     <w:p>
       <w:pPr>
@@ -1173,60 +1161,54 @@
         <w:tab/>
         <w:t>அனைத்துமாய் நின்றபர மான்மாவுக் கெய்தல்</w:t>
       </w:r>
-      <w:r>
-        <w:rPr>
-          <w:rFonts w:ascii="Latha" w:cs="Latha" w:eastAsia="Latha" w:hAnsi="Latha"/>
-          <w:sz w:val="20"/>
-          <w:szCs w:val="20"/>
-          <w:rtl w:val="0"/>
-        </w:rPr>
-        <w:br/>
-      </w:r>
-      <w:r>
-        <w:rPr>
-          <w:rFonts w:ascii="Latha" w:cs="Latha" w:eastAsia="Latha" w:hAnsi="Latha"/>
-          <w:sz w:val="20"/>
-          <w:szCs w:val="20"/>
-          <w:rtl w:val="0"/>
-        </w:rPr>
+    </w:p>
+    <w:p>
+      <w:pPr>
+        <w:spacing w:line="360" w:lineRule="auto"/>
+      </w:pPr>
+      <w:r>
+        <w:rPr>
+          <w:rFonts w:ascii="Latha" w:cs="Latha" w:eastAsia="Latha" w:hAnsi="Latha"/>
+          <w:sz w:val="20"/>
+          <w:szCs w:val="20"/>
+          <w:rtl w:val="0"/>
+        </w:rPr>
+        <w:tab/>
         <w:t>எனைத்துமே யின்றா மெனவே - மனத்துத்</w:t>
       </w:r>
-      <w:r>
-        <w:rPr>
-          <w:rFonts w:ascii="Latha" w:cs="Latha" w:eastAsia="Latha" w:hAnsi="Latha"/>
-          <w:sz w:val="20"/>
-          <w:szCs w:val="20"/>
-          <w:rtl w:val="0"/>
-        </w:rPr>
-        <w:br/>
-      </w:r>
-      <w:r>
-        <w:rPr>
-          <w:rFonts w:ascii="Latha" w:cs="Latha" w:eastAsia="Latha" w:hAnsi="Latha"/>
-          <w:sz w:val="20"/>
-          <w:szCs w:val="20"/>
-          <w:rtl w:val="0"/>
-        </w:rPr>
+    </w:p>
+    <w:p>
+      <w:pPr>
+        <w:spacing w:line="360" w:lineRule="auto"/>
+      </w:pPr>
+      <w:r>
+        <w:rPr>
+          <w:rFonts w:ascii="Latha" w:cs="Latha" w:eastAsia="Latha" w:hAnsi="Latha"/>
+          <w:sz w:val="20"/>
+          <w:szCs w:val="20"/>
+          <w:rtl w:val="0"/>
+        </w:rPr>
+        <w:tab/>
         <w:t>தருமார்த்த காமச் சலனமறக் காண்டல்</w:t>
       </w:r>
-      <w:r>
-        <w:rPr>
-          <w:rFonts w:ascii="Latha" w:cs="Latha" w:eastAsia="Latha" w:hAnsi="Latha"/>
-          <w:sz w:val="20"/>
-          <w:szCs w:val="20"/>
-          <w:rtl w:val="0"/>
-        </w:rPr>
-        <w:br/>
-      </w:r>
-      <w:r>
-        <w:rPr>
-          <w:rFonts w:ascii="Latha" w:cs="Latha" w:eastAsia="Latha" w:hAnsi="Latha"/>
-          <w:sz w:val="20"/>
-          <w:szCs w:val="20"/>
-          <w:rtl w:val="0"/>
-        </w:rPr>
+    </w:p>
+    <w:p>
+      <w:pPr>
+        <w:spacing w:line="360" w:lineRule="auto"/>
+      </w:pPr>
+      <w:r>
+        <w:rPr>
+          <w:rFonts w:ascii="Latha" w:cs="Latha" w:eastAsia="Latha" w:hAnsi="Latha"/>
+          <w:sz w:val="20"/>
+          <w:szCs w:val="20"/>
+          <w:rtl w:val="0"/>
+        </w:rPr>
+        <w:tab/>
         <w:t>பரமார்த்த தீபப் பயன்.</w:t>
       </w:r>
+    </w:p>
+    <w:p>
+      <w:pPr/>
     </w:p>
     <w:p>
       <w:pPr>
@@ -1394,60 +1376,54 @@
         <w:tab/>
         <w:t>சுகசொருப மாகச் சுடருந்தன் மெய்யே</w:t>
       </w:r>
-      <w:r>
-        <w:rPr>
-          <w:rFonts w:ascii="Latha" w:cs="Latha" w:eastAsia="Latha" w:hAnsi="Latha"/>
-          <w:sz w:val="20"/>
-          <w:szCs w:val="20"/>
-          <w:rtl w:val="0"/>
-        </w:rPr>
-        <w:br/>
-      </w:r>
-      <w:r>
-        <w:rPr>
-          <w:rFonts w:ascii="Latha" w:cs="Latha" w:eastAsia="Latha" w:hAnsi="Latha"/>
-          <w:sz w:val="20"/>
-          <w:szCs w:val="20"/>
-          <w:rtl w:val="0"/>
-        </w:rPr>
+    </w:p>
+    <w:p>
+      <w:pPr>
+        <w:spacing w:line="360" w:lineRule="auto"/>
+      </w:pPr>
+      <w:r>
+        <w:rPr>
+          <w:rFonts w:ascii="Latha" w:cs="Latha" w:eastAsia="Latha" w:hAnsi="Latha"/>
+          <w:sz w:val="20"/>
+          <w:szCs w:val="20"/>
+          <w:rtl w:val="0"/>
+        </w:rPr>
+        <w:tab/>
         <w:t>இகபரங்கட் கெல்லா மிடமாம் - தகவாற்</w:t>
       </w:r>
-      <w:r>
-        <w:rPr>
-          <w:rFonts w:ascii="Latha" w:cs="Latha" w:eastAsia="Latha" w:hAnsi="Latha"/>
-          <w:sz w:val="20"/>
-          <w:szCs w:val="20"/>
-          <w:rtl w:val="0"/>
-        </w:rPr>
-        <w:br/>
-      </w:r>
-      <w:r>
-        <w:rPr>
-          <w:rFonts w:ascii="Latha" w:cs="Latha" w:eastAsia="Latha" w:hAnsi="Latha"/>
-          <w:sz w:val="20"/>
-          <w:szCs w:val="20"/>
-          <w:rtl w:val="0"/>
-        </w:rPr>
+    </w:p>
+    <w:p>
+      <w:pPr>
+        <w:spacing w:line="360" w:lineRule="auto"/>
+      </w:pPr>
+      <w:r>
+        <w:rPr>
+          <w:rFonts w:ascii="Latha" w:cs="Latha" w:eastAsia="Latha" w:hAnsi="Latha"/>
+          <w:sz w:val="20"/>
+          <w:szCs w:val="20"/>
+          <w:rtl w:val="0"/>
+        </w:rPr>
+        <w:tab/>
         <w:t>கதியெலா மெண்ணிக் கலங்காது தன்னிற்</w:t>
       </w:r>
-      <w:r>
-        <w:rPr>
-          <w:rFonts w:ascii="Latha" w:cs="Latha" w:eastAsia="Latha" w:hAnsi="Latha"/>
-          <w:sz w:val="20"/>
-          <w:szCs w:val="20"/>
-          <w:rtl w:val="0"/>
-        </w:rPr>
-        <w:br/>
-      </w:r>
-      <w:r>
-        <w:rPr>
-          <w:rFonts w:ascii="Latha" w:cs="Latha" w:eastAsia="Latha" w:hAnsi="Latha"/>
-          <w:sz w:val="20"/>
-          <w:szCs w:val="20"/>
-          <w:rtl w:val="0"/>
-        </w:rPr>
+    </w:p>
+    <w:p>
+      <w:pPr>
+        <w:spacing w:line="360" w:lineRule="auto"/>
+      </w:pPr>
+      <w:r>
+        <w:rPr>
+          <w:rFonts w:ascii="Latha" w:cs="Latha" w:eastAsia="Latha" w:hAnsi="Latha"/>
+          <w:sz w:val="20"/>
+          <w:szCs w:val="20"/>
+          <w:rtl w:val="0"/>
+        </w:rPr>
+        <w:tab/>
         <w:t>பதிதலா மிந்நூற் பயன்.</w:t>
       </w:r>
+    </w:p>
+    <w:p>
+      <w:pPr/>
     </w:p>
     <w:p>
       <w:pPr>
@@ -1538,62 +1514,56 @@
         <w:tab/>
         <w:t>சந்தக் குருவா சகக்கோவை தேருங்கால்</w:t>
       </w:r>
-      <w:r>
-        <w:rPr>
-          <w:rFonts w:ascii="Latha" w:cs="Latha" w:eastAsia="Latha" w:hAnsi="Latha"/>
-          <w:sz w:val="20"/>
-          <w:szCs w:val="20"/>
-          <w:rtl w:val="0"/>
-        </w:rPr>
-        <w:br/>
-      </w:r>
-      <w:r>
-        <w:rPr>
-          <w:rFonts w:ascii="Latha" w:cs="Latha" w:eastAsia="Latha" w:hAnsi="Latha"/>
-          <w:sz w:val="20"/>
-          <w:szCs w:val="20"/>
-          <w:rtl w:val="0"/>
-        </w:rPr>
+    </w:p>
+    <w:p>
+      <w:pPr>
+        <w:spacing w:line="360" w:lineRule="auto"/>
+      </w:pPr>
+      <w:r>
+        <w:rPr>
+          <w:rFonts w:ascii="Latha" w:cs="Latha" w:eastAsia="Latha" w:hAnsi="Latha"/>
+          <w:sz w:val="20"/>
+          <w:szCs w:val="20"/>
+          <w:rtl w:val="0"/>
+        </w:rPr>
+        <w:tab/>
         <w:t>மந்த மதிபடைத்த மத்தனேன் - புந்தியால்</w:t>
       </w:r>
-      <w:r>
-        <w:rPr>
-          <w:rFonts w:ascii="Latha" w:cs="Latha" w:eastAsia="Latha" w:hAnsi="Latha"/>
-          <w:sz w:val="20"/>
-          <w:szCs w:val="20"/>
-          <w:rtl w:val="0"/>
-        </w:rPr>
-        <w:br/>
-      </w:r>
-      <w:r>
-        <w:rPr>
-          <w:rFonts w:ascii="Latha" w:cs="Latha" w:eastAsia="Latha" w:hAnsi="Latha"/>
-          <w:sz w:val="20"/>
-          <w:szCs w:val="20"/>
-          <w:rtl w:val="0"/>
-        </w:rPr>
+    </w:p>
+    <w:p>
+      <w:pPr>
+        <w:spacing w:line="360" w:lineRule="auto"/>
+      </w:pPr>
+      <w:r>
+        <w:rPr>
+          <w:rFonts w:ascii="Latha" w:cs="Latha" w:eastAsia="Latha" w:hAnsi="Latha"/>
+          <w:sz w:val="20"/>
+          <w:szCs w:val="20"/>
+          <w:rtl w:val="0"/>
+        </w:rPr>
+        <w:tab/>
         <w:t>எண்ணி யிசைத்ததுவன் றெண்ணா திசைப்பித்தோன்</w:t>
       </w:r>
-      <w:r>
-        <w:rPr>
-          <w:rFonts w:ascii="Latha" w:cs="Latha" w:eastAsia="Latha" w:hAnsi="Latha"/>
-          <w:sz w:val="20"/>
-          <w:szCs w:val="20"/>
-          <w:rtl w:val="0"/>
-        </w:rPr>
-        <w:br/>
-      </w:r>
-      <w:r>
-        <w:rPr>
-          <w:rFonts w:ascii="Latha" w:cs="Latha" w:eastAsia="Latha" w:hAnsi="Latha"/>
-          <w:sz w:val="20"/>
-          <w:szCs w:val="20"/>
-          <w:rtl w:val="0"/>
-        </w:rPr>
+    </w:p>
+    <w:p>
+      <w:pPr>
+        <w:spacing w:line="360" w:lineRule="auto"/>
+      </w:pPr>
+      <w:r>
+        <w:rPr>
+          <w:rFonts w:ascii="Latha" w:cs="Latha" w:eastAsia="Latha" w:hAnsi="Latha"/>
+          <w:sz w:val="20"/>
+          <w:szCs w:val="20"/>
+          <w:rtl w:val="0"/>
+        </w:rPr>
+        <w:tab/>
         <w:t>புண்ணியனாம் வேங்கடவன் போன்ம்.</w:t>
       </w:r>
     </w:p>
     <w:p>
+      <w:pPr/>
+    </w:p>
+    <w:p>
       <w:pPr>
         <w:spacing w:line="360" w:lineRule="auto"/>
       </w:pPr>
@@ -1705,62 +1675,56 @@
         <w:tab/>
         <w:t>யானென்போ தத்தா லெழுதாக் கிளவிக்கு</w:t>
       </w:r>
-      <w:r>
-        <w:rPr>
-          <w:rFonts w:ascii="Latha" w:cs="Latha" w:eastAsia="Latha" w:hAnsi="Latha"/>
-          <w:sz w:val="20"/>
-          <w:szCs w:val="20"/>
-          <w:rtl w:val="0"/>
-        </w:rPr>
-        <w:br/>
-      </w:r>
-      <w:r>
-        <w:rPr>
-          <w:rFonts w:ascii="Latha" w:cs="Latha" w:eastAsia="Latha" w:hAnsi="Latha"/>
-          <w:sz w:val="20"/>
-          <w:szCs w:val="20"/>
-          <w:rtl w:val="0"/>
-        </w:rPr>
+    </w:p>
+    <w:p>
+      <w:pPr>
+        <w:spacing w:line="360" w:lineRule="auto"/>
+      </w:pPr>
+      <w:r>
+        <w:rPr>
+          <w:rFonts w:ascii="Latha" w:cs="Latha" w:eastAsia="Latha" w:hAnsi="Latha"/>
+          <w:sz w:val="20"/>
+          <w:szCs w:val="20"/>
+          <w:rtl w:val="0"/>
+        </w:rPr>
+        <w:tab/>
         <w:t>யானே னியம்ப லவையடக்கம் - மோன</w:t>
       </w:r>
-      <w:r>
-        <w:rPr>
-          <w:rFonts w:ascii="Latha" w:cs="Latha" w:eastAsia="Latha" w:hAnsi="Latha"/>
-          <w:sz w:val="20"/>
-          <w:szCs w:val="20"/>
-          <w:rtl w:val="0"/>
-        </w:rPr>
-        <w:br/>
-      </w:r>
-      <w:r>
-        <w:rPr>
-          <w:rFonts w:ascii="Latha" w:cs="Latha" w:eastAsia="Latha" w:hAnsi="Latha"/>
-          <w:sz w:val="20"/>
-          <w:szCs w:val="20"/>
-          <w:rtl w:val="0"/>
-        </w:rPr>
+    </w:p>
+    <w:p>
+      <w:pPr>
+        <w:spacing w:line="360" w:lineRule="auto"/>
+      </w:pPr>
+      <w:r>
+        <w:rPr>
+          <w:rFonts w:ascii="Latha" w:cs="Latha" w:eastAsia="Latha" w:hAnsi="Latha"/>
+          <w:sz w:val="20"/>
+          <w:szCs w:val="20"/>
+          <w:rtl w:val="0"/>
+        </w:rPr>
+        <w:tab/>
         <w:t>சமாதியா லுள்ளத்துட் சான்றோர்தே ரந்தப்</w:t>
       </w:r>
-      <w:r>
-        <w:rPr>
-          <w:rFonts w:ascii="Latha" w:cs="Latha" w:eastAsia="Latha" w:hAnsi="Latha"/>
-          <w:sz w:val="20"/>
-          <w:szCs w:val="20"/>
-          <w:rtl w:val="0"/>
-        </w:rPr>
-        <w:br/>
-      </w:r>
-      <w:r>
-        <w:rPr>
-          <w:rFonts w:ascii="Latha" w:cs="Latha" w:eastAsia="Latha" w:hAnsi="Latha"/>
-          <w:sz w:val="20"/>
-          <w:szCs w:val="20"/>
-          <w:rtl w:val="0"/>
-        </w:rPr>
+    </w:p>
+    <w:p>
+      <w:pPr>
+        <w:spacing w:line="360" w:lineRule="auto"/>
+      </w:pPr>
+      <w:r>
+        <w:rPr>
+          <w:rFonts w:ascii="Latha" w:cs="Latha" w:eastAsia="Latha" w:hAnsi="Latha"/>
+          <w:sz w:val="20"/>
+          <w:szCs w:val="20"/>
+          <w:rtl w:val="0"/>
+        </w:rPr>
+        <w:tab/>
         <w:t>புமானதே யிந்நூற் பொறுப்பு.</w:t>
       </w:r>
     </w:p>
     <w:p>
+      <w:pPr/>
+    </w:p>
+    <w:p>
       <w:pPr>
         <w:spacing w:line="360" w:lineRule="auto"/>
       </w:pPr>
@@ -1773,6 +1737,9 @@
         </w:rPr>
         <w:t>யான் என் போதத்தால் எழுதாக் கிளவிக்கு யான் ஏன் இயம்பல் அவை அடக்கம் மோன சமாதியால் உள்ளத்துள் சான்றோர் தேர் அந்தப் புமானதே இந்நூல் பொறுப்பு.</w:t>
       </w:r>
+    </w:p>
+    <w:p>
+      <w:pPr/>
     </w:p>
     <w:p>
       <w:pPr>

</xml_diff>